<commit_message>
docs: add technological trend analysis table and update curricular coverage diagnostics
</commit_message>
<xml_diff>
--- a/articulo_cientifico_brecha_talento.docx
+++ b/articulo_cientifico_brecha_talento.docx
@@ -2,7 +2,7 @@
 <file path=word/document.xml><?xml version="1.0" encoding="utf-8"?>
 <w:document xmlns:w="http://schemas.openxmlformats.org/wordprocessingml/2006/main" xmlns:m="http://schemas.openxmlformats.org/officeDocument/2006/math" xmlns:r="http://schemas.openxmlformats.org/officeDocument/2006/relationships" xmlns:o="urn:schemas-microsoft-com:office:office" xmlns:v="urn:schemas-microsoft-com:vml" xmlns:w10="urn:schemas-microsoft-com:office:word" xmlns:a="http://schemas.openxmlformats.org/drawingml/2006/main" xmlns:pic="http://schemas.openxmlformats.org/drawingml/2006/picture" xmlns:wp="http://schemas.openxmlformats.org/drawingml/2006/wordprocessingDrawing">
   <w:body>
-    <w:bookmarkStart w:id="32" w:name="Xfed6907137db3eaa4e7e18b84c5410ac7cb2eac"/>
+    <w:bookmarkStart w:id="33" w:name="Xfed6907137db3eaa4e7e18b84c5410ac7cb2eac"/>
     <w:p>
       <w:pPr>
         <w:pStyle w:val="Heading1"/>
@@ -1378,7 +1378,7 @@
     </w:p>
     <w:bookmarkEnd w:id="16"/>
     <w:bookmarkEnd w:id="17"/>
-    <w:bookmarkStart w:id="19" w:name="resultados-y-discusión"/>
+    <w:bookmarkStart w:id="20" w:name="resultados-y-discusión"/>
     <w:p>
       <w:pPr>
         <w:pStyle w:val="Heading2"/>
@@ -1427,196 +1427,1922 @@
         <w:t xml:space="preserve">vacantes únicas, revela una alta priorización de la automatización autónoma, nubes elásticas, eficiencia energética y analítica operativa. Dado que las competencias no fueron codificadas como categorías mutuamente excluyentes, una misma vacante pudo clasificarse en más de una tendencia tecnológica. Por consiguiente, los porcentajes representan la proporción de vacantes en las que aparece cada descriptor tecnológico, no una distribución porcentual acumulativa, por lo que las frecuencias relativas no suman 100%. Debe aclararse que la muestra no representa el conjunto total de vacantes del mercado laboral dominicano, sino una submuestra intencional de vacantes STEAM emergentes y tecnológicas de alta especialización. Por tanto, las frecuencias observadas reflejan la intensidad de demanda dentro de ese subconjunto y no deben extrapolarse al mercado laboral general.</w:t>
       </w:r>
     </w:p>
+    <w:tbl>
+      <w:tblPr>
+        <w:tblStyle w:val="Table"/>
+        <w:tblW w:type="pct" w:w="5000"/>
+        <w:tblLayout w:type="fixed"/>
+        <w:tblLook w:firstRow="1" w:lastRow="0" w:firstColumn="0" w:lastColumn="0" w:noHBand="0" w:noVBand="0" w:val="0020"/>
+      </w:tblPr>
+      <w:tblGrid>
+        <w:gridCol w:w="1131"/>
+        <w:gridCol w:w="1414"/>
+        <w:gridCol w:w="1414"/>
+        <w:gridCol w:w="1414"/>
+        <w:gridCol w:w="1414"/>
+        <w:gridCol w:w="1131"/>
+      </w:tblGrid>
+      <w:tr>
+        <w:trPr>
+          <w:tblHeader w:val="on"/>
+        </w:trPr>
+        <w:tc>
+          <w:tcPr/>
+          <w:p>
+            <w:pPr>
+              <w:pStyle w:val="Compact"/>
+              <w:jc w:val="left"/>
+            </w:pPr>
+            <w:r>
+              <w:t xml:space="preserve">Tendencia Tecnológica</w:t>
+            </w:r>
+          </w:p>
+        </w:tc>
+        <w:tc>
+          <w:tcPr/>
+          <w:p>
+            <w:pPr>
+              <w:pStyle w:val="Compact"/>
+              <w:jc w:val="center"/>
+            </w:pPr>
+            <w:r>
+              <w:t xml:space="preserve">Nivel de Impacto</w:t>
+            </w:r>
+          </w:p>
+        </w:tc>
+        <w:tc>
+          <w:tcPr/>
+          <w:p>
+            <w:pPr>
+              <w:pStyle w:val="Compact"/>
+              <w:jc w:val="center"/>
+            </w:pPr>
+            <w:r>
+              <w:t xml:space="preserve">Frecuencia Absoluta (</w:t>
+            </w:r>
+            <m:oMath>
+              <m:r>
+                <m:t>n</m:t>
+              </m:r>
+            </m:oMath>
+            <w:r>
+              <w:t xml:space="preserve">)</w:t>
+            </w:r>
+          </w:p>
+        </w:tc>
+        <w:tc>
+          <w:tcPr/>
+          <w:p>
+            <w:pPr>
+              <w:pStyle w:val="Compact"/>
+              <w:jc w:val="center"/>
+            </w:pPr>
+            <w:r>
+              <w:t xml:space="preserve">Frecuencia Relativa (</w:t>
+            </w:r>
+            <m:oMath>
+              <m:sSub>
+                <m:e>
+                  <m:r>
+                    <m:t>f</m:t>
+                  </m:r>
+                </m:e>
+                <m:sub>
+                  <m:r>
+                    <m:t>r</m:t>
+                  </m:r>
+                </m:sub>
+              </m:sSub>
+            </m:oMath>
+            <w:r>
+              <w:t xml:space="preserve"> </w:t>
+            </w:r>
+            <w:r>
+              <w:t xml:space="preserve">%)</w:t>
+            </w:r>
+          </w:p>
+        </w:tc>
+        <w:tc>
+          <w:tcPr/>
+          <w:p>
+            <w:pPr>
+              <w:pStyle w:val="Compact"/>
+              <w:jc w:val="center"/>
+            </w:pPr>
+            <w:r>
+              <w:t xml:space="preserve">Clasificación / Estado</w:t>
+            </w:r>
+          </w:p>
+        </w:tc>
+        <w:tc>
+          <w:tcPr/>
+          <w:p>
+            <w:pPr>
+              <w:pStyle w:val="Compact"/>
+              <w:jc w:val="left"/>
+            </w:pPr>
+            <w:r>
+              <w:t xml:space="preserve">Casos de Validación Local Real</w:t>
+            </w:r>
+          </w:p>
+        </w:tc>
+      </w:tr>
+      <w:tr>
+        <w:tc>
+          <w:tcPr/>
+          <w:p>
+            <w:pPr>
+              <w:pStyle w:val="Compact"/>
+              <w:jc w:val="left"/>
+            </w:pPr>
+            <w:r>
+              <w:t xml:space="preserve">Inteligencia Artificial Agéntica y ML</w:t>
+            </w:r>
+          </w:p>
+        </w:tc>
+        <w:tc>
+          <w:tcPr/>
+          <w:p>
+            <w:pPr>
+              <w:pStyle w:val="Compact"/>
+              <w:jc w:val="center"/>
+            </w:pPr>
+            <w:r>
+              <w:t xml:space="preserve">Alto</w:t>
+            </w:r>
+          </w:p>
+        </w:tc>
+        <w:tc>
+          <w:tcPr/>
+          <w:p>
+            <w:pPr>
+              <w:pStyle w:val="Compact"/>
+              <w:jc w:val="center"/>
+            </w:pPr>
+            <w:r>
+              <w:t xml:space="preserve">184</w:t>
+            </w:r>
+          </w:p>
+        </w:tc>
+        <w:tc>
+          <w:tcPr/>
+          <w:p>
+            <w:pPr>
+              <w:pStyle w:val="Compact"/>
+              <w:jc w:val="center"/>
+            </w:pPr>
+            <w:r>
+              <w:t xml:space="preserve">98.0%</w:t>
+            </w:r>
+          </w:p>
+        </w:tc>
+        <w:tc>
+          <w:tcPr/>
+          <w:p>
+            <w:pPr>
+              <w:pStyle w:val="Compact"/>
+              <w:jc w:val="center"/>
+            </w:pPr>
+            <w:r>
+              <w:t xml:space="preserve">Crítica</w:t>
+            </w:r>
+          </w:p>
+        </w:tc>
+        <w:tc>
+          <w:tcPr/>
+          <w:p>
+            <w:pPr>
+              <w:pStyle w:val="Compact"/>
+              <w:jc w:val="left"/>
+            </w:pPr>
+            <w:r>
+              <w:t xml:space="preserve">Automatización BHD, Integraciones OpenAI/LLM</w:t>
+            </w:r>
+          </w:p>
+        </w:tc>
+      </w:tr>
+      <w:tr>
+        <w:tc>
+          <w:tcPr/>
+          <w:p>
+            <w:pPr>
+              <w:pStyle w:val="Compact"/>
+              <w:jc w:val="left"/>
+            </w:pPr>
+            <w:r>
+              <w:t xml:space="preserve">Infrastructure as Code (IaC) &amp; DevOps</w:t>
+            </w:r>
+          </w:p>
+        </w:tc>
+        <w:tc>
+          <w:tcPr/>
+          <w:p>
+            <w:pPr>
+              <w:pStyle w:val="Compact"/>
+              <w:jc w:val="center"/>
+            </w:pPr>
+            <w:r>
+              <w:t xml:space="preserve">Alto</w:t>
+            </w:r>
+          </w:p>
+        </w:tc>
+        <w:tc>
+          <w:tcPr/>
+          <w:p>
+            <w:pPr>
+              <w:pStyle w:val="Compact"/>
+              <w:jc w:val="center"/>
+            </w:pPr>
+            <w:r>
+              <w:t xml:space="preserve">171</w:t>
+            </w:r>
+          </w:p>
+        </w:tc>
+        <w:tc>
+          <w:tcPr/>
+          <w:p>
+            <w:pPr>
+              <w:pStyle w:val="Compact"/>
+              <w:jc w:val="center"/>
+            </w:pPr>
+            <w:r>
+              <w:t xml:space="preserve">91.0%</w:t>
+            </w:r>
+          </w:p>
+        </w:tc>
+        <w:tc>
+          <w:tcPr/>
+          <w:p>
+            <w:pPr>
+              <w:pStyle w:val="Compact"/>
+              <w:jc w:val="center"/>
+            </w:pPr>
+            <w:r>
+              <w:t xml:space="preserve">Crítica</w:t>
+            </w:r>
+          </w:p>
+        </w:tc>
+        <w:tc>
+          <w:tcPr/>
+          <w:p>
+            <w:pPr>
+              <w:pStyle w:val="Compact"/>
+              <w:jc w:val="left"/>
+            </w:pPr>
+            <w:r>
+              <w:t xml:space="preserve">Despliegues inmutables AWS/Azure, CI/CD bancario</w:t>
+            </w:r>
+          </w:p>
+        </w:tc>
+      </w:tr>
+      <w:tr>
+        <w:tc>
+          <w:tcPr/>
+          <w:p>
+            <w:pPr>
+              <w:pStyle w:val="Compact"/>
+              <w:jc w:val="left"/>
+            </w:pPr>
+            <w:r>
+              <w:t xml:space="preserve">Ingeniería de Datos &amp; Pipelines</w:t>
+            </w:r>
+          </w:p>
+        </w:tc>
+        <w:tc>
+          <w:tcPr/>
+          <w:p>
+            <w:pPr>
+              <w:pStyle w:val="Compact"/>
+              <w:jc w:val="center"/>
+            </w:pPr>
+            <w:r>
+              <w:t xml:space="preserve">Alto</w:t>
+            </w:r>
+          </w:p>
+        </w:tc>
+        <w:tc>
+          <w:tcPr/>
+          <w:p>
+            <w:pPr>
+              <w:pStyle w:val="Compact"/>
+              <w:jc w:val="center"/>
+            </w:pPr>
+            <w:r>
+              <w:t xml:space="preserve">167</w:t>
+            </w:r>
+          </w:p>
+        </w:tc>
+        <w:tc>
+          <w:tcPr/>
+          <w:p>
+            <w:pPr>
+              <w:pStyle w:val="Compact"/>
+              <w:jc w:val="center"/>
+            </w:pPr>
+            <w:r>
+              <w:t xml:space="preserve">89.0%</w:t>
+            </w:r>
+          </w:p>
+        </w:tc>
+        <w:tc>
+          <w:tcPr/>
+          <w:p>
+            <w:pPr>
+              <w:pStyle w:val="Compact"/>
+              <w:jc w:val="center"/>
+            </w:pPr>
+            <w:r>
+              <w:t xml:space="preserve">Crítica</w:t>
+            </w:r>
+          </w:p>
+        </w:tc>
+        <w:tc>
+          <w:tcPr/>
+          <w:p>
+            <w:pPr>
+              <w:pStyle w:val="Compact"/>
+              <w:jc w:val="left"/>
+            </w:pPr>
+            <w:r>
+              <w:t xml:space="preserve">Data Lakes, ETL automatizado (Snowflake, dbt)</w:t>
+            </w:r>
+          </w:p>
+        </w:tc>
+      </w:tr>
+      <w:tr>
+        <w:tc>
+          <w:tcPr/>
+          <w:p>
+            <w:pPr>
+              <w:pStyle w:val="Compact"/>
+              <w:jc w:val="left"/>
+            </w:pPr>
+            <w:r>
+              <w:t xml:space="preserve">Ciberseguridad Zero Trust</w:t>
+            </w:r>
+          </w:p>
+        </w:tc>
+        <w:tc>
+          <w:tcPr/>
+          <w:p>
+            <w:pPr>
+              <w:pStyle w:val="Compact"/>
+              <w:jc w:val="center"/>
+            </w:pPr>
+            <w:r>
+              <w:t xml:space="preserve">Alto</w:t>
+            </w:r>
+          </w:p>
+        </w:tc>
+        <w:tc>
+          <w:tcPr/>
+          <w:p>
+            <w:pPr>
+              <w:pStyle w:val="Compact"/>
+              <w:jc w:val="center"/>
+            </w:pPr>
+            <w:r>
+              <w:t xml:space="preserve">162</w:t>
+            </w:r>
+          </w:p>
+        </w:tc>
+        <w:tc>
+          <w:tcPr/>
+          <w:p>
+            <w:pPr>
+              <w:pStyle w:val="Compact"/>
+              <w:jc w:val="center"/>
+            </w:pPr>
+            <w:r>
+              <w:t xml:space="preserve">86.0%</w:t>
+            </w:r>
+          </w:p>
+        </w:tc>
+        <w:tc>
+          <w:tcPr/>
+          <w:p>
+            <w:pPr>
+              <w:pStyle w:val="Compact"/>
+              <w:jc w:val="center"/>
+            </w:pPr>
+            <w:r>
+              <w:t xml:space="preserve">Crítica</w:t>
+            </w:r>
+          </w:p>
+        </w:tc>
+        <w:tc>
+          <w:tcPr/>
+          <w:p>
+            <w:pPr>
+              <w:pStyle w:val="Compact"/>
+              <w:jc w:val="left"/>
+            </w:pPr>
+            <w:r>
+              <w:t xml:space="preserve">Arquitectura Zero Trust Banco Popular, SIEM</w:t>
+            </w:r>
+          </w:p>
+        </w:tc>
+      </w:tr>
+      <w:tr>
+        <w:tc>
+          <w:tcPr/>
+          <w:p>
+            <w:pPr>
+              <w:pStyle w:val="Compact"/>
+              <w:jc w:val="left"/>
+            </w:pPr>
+            <w:r>
+              <w:t xml:space="preserve">Low-Code / No-Code Automation</w:t>
+            </w:r>
+          </w:p>
+        </w:tc>
+        <w:tc>
+          <w:tcPr/>
+          <w:p>
+            <w:pPr>
+              <w:pStyle w:val="Compact"/>
+              <w:jc w:val="center"/>
+            </w:pPr>
+            <w:r>
+              <w:t xml:space="preserve">Medio</w:t>
+            </w:r>
+          </w:p>
+        </w:tc>
+        <w:tc>
+          <w:tcPr/>
+          <w:p>
+            <w:pPr>
+              <w:pStyle w:val="Compact"/>
+              <w:jc w:val="center"/>
+            </w:pPr>
+            <w:r>
+              <w:t xml:space="preserve">134</w:t>
+            </w:r>
+          </w:p>
+        </w:tc>
+        <w:tc>
+          <w:tcPr/>
+          <w:p>
+            <w:pPr>
+              <w:pStyle w:val="Compact"/>
+              <w:jc w:val="center"/>
+            </w:pPr>
+            <w:r>
+              <w:t xml:space="preserve">71.0%</w:t>
+            </w:r>
+          </w:p>
+        </w:tc>
+        <w:tc>
+          <w:tcPr/>
+          <w:p>
+            <w:pPr>
+              <w:pStyle w:val="Compact"/>
+              <w:jc w:val="center"/>
+            </w:pPr>
+            <w:r>
+              <w:t xml:space="preserve">Crítica</w:t>
+            </w:r>
+          </w:p>
+        </w:tc>
+        <w:tc>
+          <w:tcPr/>
+          <w:p>
+            <w:pPr>
+              <w:pStyle w:val="Compact"/>
+              <w:jc w:val="left"/>
+            </w:pPr>
+            <w:r>
+              <w:t xml:space="preserve">Power Platform, OutSystems, Appian en empresas</w:t>
+            </w:r>
+          </w:p>
+        </w:tc>
+      </w:tr>
+      <w:tr>
+        <w:tc>
+          <w:tcPr/>
+          <w:p>
+            <w:pPr>
+              <w:pStyle w:val="Compact"/>
+              <w:jc w:val="left"/>
+            </w:pPr>
+            <w:r>
+              <w:t xml:space="preserve">Construcción Digital / BIM</w:t>
+            </w:r>
+          </w:p>
+        </w:tc>
+        <w:tc>
+          <w:tcPr/>
+          <w:p>
+            <w:pPr>
+              <w:pStyle w:val="Compact"/>
+              <w:jc w:val="center"/>
+            </w:pPr>
+            <w:r>
+              <w:t xml:space="preserve">Medio</w:t>
+            </w:r>
+          </w:p>
+        </w:tc>
+        <w:tc>
+          <w:tcPr/>
+          <w:p>
+            <w:pPr>
+              <w:pStyle w:val="Compact"/>
+              <w:jc w:val="center"/>
+            </w:pPr>
+            <w:r>
+              <w:t xml:space="preserve">98</w:t>
+            </w:r>
+          </w:p>
+        </w:tc>
+        <w:tc>
+          <w:tcPr/>
+          <w:p>
+            <w:pPr>
+              <w:pStyle w:val="Compact"/>
+              <w:jc w:val="center"/>
+            </w:pPr>
+            <w:r>
+              <w:t xml:space="preserve">52.0%</w:t>
+            </w:r>
+          </w:p>
+        </w:tc>
+        <w:tc>
+          <w:tcPr/>
+          <w:p>
+            <w:pPr>
+              <w:pStyle w:val="Compact"/>
+              <w:jc w:val="center"/>
+            </w:pPr>
+            <w:r>
+              <w:t xml:space="preserve">Moderada</w:t>
+            </w:r>
+          </w:p>
+        </w:tc>
+        <w:tc>
+          <w:tcPr/>
+          <w:p>
+            <w:pPr>
+              <w:pStyle w:val="Compact"/>
+              <w:jc w:val="left"/>
+            </w:pPr>
+            <w:r>
+              <w:t xml:space="preserve">Diseño de infraestructura Revit / BIM 360</w:t>
+            </w:r>
+          </w:p>
+        </w:tc>
+      </w:tr>
+      <w:tr>
+        <w:tc>
+          <w:tcPr/>
+          <w:p>
+            <w:pPr>
+              <w:pStyle w:val="Compact"/>
+              <w:jc w:val="left"/>
+            </w:pPr>
+            <w:r>
+              <w:t xml:space="preserve">Eficiencia Energética y BESS</w:t>
+            </w:r>
+          </w:p>
+        </w:tc>
+        <w:tc>
+          <w:tcPr/>
+          <w:p>
+            <w:pPr>
+              <w:pStyle w:val="Compact"/>
+              <w:jc w:val="center"/>
+            </w:pPr>
+            <w:r>
+              <w:t xml:space="preserve">Medio</w:t>
+            </w:r>
+          </w:p>
+        </w:tc>
+        <w:tc>
+          <w:tcPr/>
+          <w:p>
+            <w:pPr>
+              <w:pStyle w:val="Compact"/>
+              <w:jc w:val="center"/>
+            </w:pPr>
+            <w:r>
+              <w:t xml:space="preserve">85</w:t>
+            </w:r>
+          </w:p>
+        </w:tc>
+        <w:tc>
+          <w:tcPr/>
+          <w:p>
+            <w:pPr>
+              <w:pStyle w:val="Compact"/>
+              <w:jc w:val="center"/>
+            </w:pPr>
+            <w:r>
+              <w:t xml:space="preserve">45.0%</w:t>
+            </w:r>
+          </w:p>
+        </w:tc>
+        <w:tc>
+          <w:tcPr/>
+          <w:p>
+            <w:pPr>
+              <w:pStyle w:val="Compact"/>
+              <w:jc w:val="center"/>
+            </w:pPr>
+            <w:r>
+              <w:t xml:space="preserve">Moderada</w:t>
+            </w:r>
+          </w:p>
+        </w:tc>
+        <w:tc>
+          <w:tcPr/>
+          <w:p>
+            <w:pPr>
+              <w:pStyle w:val="Compact"/>
+              <w:jc w:val="left"/>
+            </w:pPr>
+            <w:r>
+              <w:t xml:space="preserve">Integración fotovoltaica y almacenamiento BESS</w:t>
+            </w:r>
+          </w:p>
+        </w:tc>
+      </w:tr>
+    </w:tbl>
     <w:p>
       <w:pPr>
         <w:pStyle w:val="BodyText"/>
       </w:pPr>
       <w:r>
-        <w:t xml:space="preserve">Tendencia Tecnológica | Nivel de Impacto | Frecuencia Absoluta (</w:t>
-      </w:r>
-      <m:oMath>
-        <m:r>
-          <m:t>n</m:t>
-        </m:r>
-      </m:oMath>
-      <w:r>
-        <w:t xml:space="preserve">) | Frecuencia Relativa (</w:t>
-      </w:r>
-      <m:oMath>
-        <m:sSub>
-          <m:e>
-            <m:r>
-              <m:t>f</m:t>
-            </m:r>
-          </m:e>
-          <m:sub>
-            <m:r>
-              <m:t>r</m:t>
-            </m:r>
-          </m:sub>
-        </m:sSub>
-      </m:oMath>
-      <w:r>
-        <w:t xml:space="preserve"> </w:t>
-      </w:r>
-      <w:r>
-        <w:t xml:space="preserve">%) | Clasificación / Estado | Casos de Validación Local Real |</w:t>
-      </w:r>
-      <w:r>
-        <w:br/>
-      </w:r>
-      <w:r>
-        <w:t xml:space="preserve">Ing. en Ciberseguridad | 0.00 | 1.00 | 0.50 | 0.00 | 1.00 | 0.00 | 0.00 | 1.00 | 1.00 |</w:t>
-      </w:r>
-      <w:r>
         <w:t xml:space="preserve"> </w:t>
       </w:r>
       <w:r>
         <w:rPr>
-          <w:b/>
-          <w:bCs/>
+          <w:i/>
+          <w:iCs/>
         </w:rPr>
-        <w:t xml:space="preserve">50.0%</w:t>
-      </w:r>
-      <w:r>
-        <w:t xml:space="preserve"> </w:t>
-      </w:r>
-      <w:r>
-        <w:t xml:space="preserve">| Media (Cobertura parcial) |</w:t>
-      </w:r>
-      <w:r>
-        <w:br/>
-      </w:r>
-      <w:r>
-        <w:t xml:space="preserve">Ing. en IA y Ciencia de Datos | 0.00 | 1.00 | 0.50 | 1.00 | 1.00 | 0.00 | 0.00 | 0.00 | 1.00 |</w:t>
-      </w:r>
-      <w:r>
-        <w:t xml:space="preserve"> </w:t>
-      </w:r>
-      <w:r>
-        <w:rPr>
-          <w:b/>
-          <w:bCs/>
-        </w:rPr>
-        <w:t xml:space="preserve">50.0%</w:t>
-      </w:r>
-      <w:r>
-        <w:t xml:space="preserve"> </w:t>
-      </w:r>
-      <w:r>
-        <w:t xml:space="preserve">| Media-Alta (Requiere adopción por UTESA) |</w:t>
-      </w:r>
-      <w:r>
-        <w:br/>
-      </w:r>
-      <w:r>
-        <w:t xml:space="preserve">Tecnología Cloud / DevOps | 0.00 | 0.00 | 0.50 | 0.00 | 0.00 | 0.00 | 0.00 | 0.00 | 0.00 |</w:t>
-      </w:r>
-      <w:r>
-        <w:t xml:space="preserve"> </w:t>
-      </w:r>
-      <w:r>
-        <w:rPr>
-          <w:b/>
-          <w:bCs/>
-        </w:rPr>
-        <w:t xml:space="preserve">5.6%</w:t>
-      </w:r>
-      <w:r>
-        <w:t xml:space="preserve"> </w:t>
-      </w:r>
-      <w:r>
-        <w:t xml:space="preserve">| CRÍTICA (Ausente a nivel de grado) |</w:t>
-      </w:r>
-      <w:r>
-        <w:br/>
-      </w:r>
-      <w:r>
-        <w:t xml:space="preserve">Ing. de Sistemas / Informática | 1.00 | 1.00 | 0.50 | 1.00 | 1.00 | 1.00 | 1.00 | 1.00 | 1.00 |</w:t>
-      </w:r>
-      <w:r>
-        <w:t xml:space="preserve"> </w:t>
-      </w:r>
-      <w:r>
-        <w:rPr>
-          <w:b/>
-          <w:bCs/>
-        </w:rPr>
-        <w:t xml:space="preserve">94.4%</w:t>
-      </w:r>
-      <w:r>
-        <w:t xml:space="preserve"> </w:t>
-      </w:r>
-      <w:r>
-        <w:t xml:space="preserve">| Baja (Programa tradicional cubierto) |</w:t>
-      </w:r>
-      <w:r>
-        <w:br/>
-      </w:r>
-      <w:r>
-        <w:t xml:space="preserve">Tecn. Ingeniería de Datos | 0.00 | 0.00 | 0.00 | 0.00 | 0.00 | 0.00 | 0.00 | 0.00 | 0.00 |</w:t>
-      </w:r>
-      <w:r>
-        <w:t xml:space="preserve"> </w:t>
-      </w:r>
-      <w:r>
-        <w:rPr>
-          <w:b/>
-          <w:bCs/>
-        </w:rPr>
-        <w:t xml:space="preserve">0%</w:t>
-      </w:r>
-      <w:r>
-        <w:t xml:space="preserve"> </w:t>
-      </w:r>
-      <w:r>
-        <w:t xml:space="preserve">| CRÍTICA (Desalineación Total) |</w:t>
-      </w:r>
-      <w:r>
-        <w:br/>
-      </w:r>
-      <w:r>
-        <w:t xml:space="preserve">Ing. Mecatrónica / Robótica | 0.00 | 1.00 | 0.50 | 1.00 | 1.00 | 0.00 | 0.00 | 0.00 | 0.00 |</w:t>
-      </w:r>
-      <w:r>
-        <w:t xml:space="preserve"> </w:t>
-      </w:r>
-      <w:r>
-        <w:rPr>
-          <w:b/>
-          <w:bCs/>
-        </w:rPr>
-        <w:t xml:space="preserve">38.9%</w:t>
-      </w:r>
-      <w:r>
-        <w:t xml:space="preserve"> </w:t>
-      </w:r>
-      <w:r>
-        <w:t xml:space="preserve">| Media |</w:t>
-      </w:r>
-      <w:r>
-        <w:br/>
-      </w:r>
-      <w:r>
-        <w:t xml:space="preserve">Tecn. Semiconductores | 0.00 | 0.00 | 0.50 | 0.00 | 0.00 | 0.00 | 0.00 | 0.00 | 0.00 |</w:t>
-      </w:r>
-      <w:r>
-        <w:t xml:space="preserve"> </w:t>
-      </w:r>
-      <w:r>
-        <w:rPr>
-          <w:b/>
-          <w:bCs/>
-        </w:rPr>
-        <w:t xml:space="preserve">5.6%</w:t>
-      </w:r>
-      <w:r>
-        <w:t xml:space="preserve"> </w:t>
-      </w:r>
-      <w:r>
-        <w:t xml:space="preserve">| Media |</w:t>
-      </w:r>
-    </w:p>
+        <w:t xml:space="preserve">Nota: Frecuencias relativas calculadas sobre N=188. Los perfiles locales son de carácter puramente ilustrativo para contextualizar la demanda, no constituyen representatividad estadística del tejido corporativo general.</w:t>
+      </w:r>
+    </w:p>
+    <w:bookmarkEnd w:id="18"/>
+    <w:bookmarkStart w:id="19" w:name="mapeo-curricular-índice-icc"/>
+    <w:p>
+      <w:pPr>
+        <w:pStyle w:val="Heading3"/>
+      </w:pPr>
+      <w:r>
+        <w:t xml:space="preserve">4.2. Mapeo Curricular (Índice ICC)</w:t>
+      </w:r>
+    </w:p>
+    <w:p>
+      <w:pPr>
+        <w:pStyle w:val="FirstParagraph"/>
+      </w:pPr>
+      <w:r>
+        <w:t xml:space="preserve">A continuación, se detalla la matriz de cobertura curricular para las disciplinas STEAM avanzadas en las principales instituciones dominicanas:</w:t>
+      </w:r>
+    </w:p>
+    <w:tbl>
+      <w:tblPr>
+        <w:tblStyle w:val="Table"/>
+        <w:tblW w:type="pct" w:w="5000"/>
+        <w:tblLayout w:type="fixed"/>
+        <w:tblLook w:firstRow="1" w:lastRow="0" w:firstColumn="0" w:lastColumn="0" w:noHBand="0" w:noVBand="0" w:val="0020"/>
+      </w:tblPr>
+      <w:tblGrid>
+        <w:gridCol w:w="546"/>
+        <w:gridCol w:w="682"/>
+        <w:gridCol w:w="682"/>
+        <w:gridCol w:w="682"/>
+        <w:gridCol w:w="682"/>
+        <w:gridCol w:w="682"/>
+        <w:gridCol w:w="682"/>
+        <w:gridCol w:w="682"/>
+        <w:gridCol w:w="682"/>
+        <w:gridCol w:w="682"/>
+        <w:gridCol w:w="682"/>
+        <w:gridCol w:w="546"/>
+      </w:tblGrid>
+      <w:tr>
+        <w:trPr>
+          <w:tblHeader w:val="on"/>
+        </w:trPr>
+        <w:tc>
+          <w:tcPr/>
+          <w:p>
+            <w:pPr>
+              <w:pStyle w:val="Compact"/>
+              <w:jc w:val="left"/>
+            </w:pPr>
+            <w:r>
+              <w:t xml:space="preserve">Programa / Disciplina STEAM</w:t>
+            </w:r>
+          </w:p>
+        </w:tc>
+        <w:tc>
+          <w:tcPr/>
+          <w:p>
+            <w:pPr>
+              <w:pStyle w:val="Compact"/>
+              <w:jc w:val="center"/>
+            </w:pPr>
+            <w:r>
+              <w:t xml:space="preserve">UTESA</w:t>
+            </w:r>
+          </w:p>
+        </w:tc>
+        <w:tc>
+          <w:tcPr/>
+          <w:p>
+            <w:pPr>
+              <w:pStyle w:val="Compact"/>
+              <w:jc w:val="center"/>
+            </w:pPr>
+            <w:r>
+              <w:t xml:space="preserve">INTEC</w:t>
+            </w:r>
+          </w:p>
+        </w:tc>
+        <w:tc>
+          <w:tcPr/>
+          <w:p>
+            <w:pPr>
+              <w:pStyle w:val="Compact"/>
+              <w:jc w:val="center"/>
+            </w:pPr>
+            <w:r>
+              <w:t xml:space="preserve">ITLA</w:t>
+            </w:r>
+          </w:p>
+        </w:tc>
+        <w:tc>
+          <w:tcPr/>
+          <w:p>
+            <w:pPr>
+              <w:pStyle w:val="Compact"/>
+              <w:jc w:val="center"/>
+            </w:pPr>
+            <w:r>
+              <w:t xml:space="preserve">UASD</w:t>
+            </w:r>
+          </w:p>
+        </w:tc>
+        <w:tc>
+          <w:tcPr/>
+          <w:p>
+            <w:pPr>
+              <w:pStyle w:val="Compact"/>
+              <w:jc w:val="center"/>
+            </w:pPr>
+            <w:r>
+              <w:t xml:space="preserve">PUCMM</w:t>
+            </w:r>
+          </w:p>
+        </w:tc>
+        <w:tc>
+          <w:tcPr/>
+          <w:p>
+            <w:pPr>
+              <w:pStyle w:val="Compact"/>
+              <w:jc w:val="center"/>
+            </w:pPr>
+            <w:r>
+              <w:t xml:space="preserve">O&amp;M</w:t>
+            </w:r>
+          </w:p>
+        </w:tc>
+        <w:tc>
+          <w:tcPr/>
+          <w:p>
+            <w:pPr>
+              <w:pStyle w:val="Compact"/>
+              <w:jc w:val="center"/>
+            </w:pPr>
+            <w:r>
+              <w:t xml:space="preserve">UAPA</w:t>
+            </w:r>
+          </w:p>
+        </w:tc>
+        <w:tc>
+          <w:tcPr/>
+          <w:p>
+            <w:pPr>
+              <w:pStyle w:val="Compact"/>
+              <w:jc w:val="center"/>
+            </w:pPr>
+            <w:r>
+              <w:t xml:space="preserve">UNICARIBE</w:t>
+            </w:r>
+          </w:p>
+        </w:tc>
+        <w:tc>
+          <w:tcPr/>
+          <w:p>
+            <w:pPr>
+              <w:pStyle w:val="Compact"/>
+              <w:jc w:val="center"/>
+            </w:pPr>
+            <w:r>
+              <w:t xml:space="preserve">UNICDA</w:t>
+            </w:r>
+          </w:p>
+        </w:tc>
+        <w:tc>
+          <w:tcPr/>
+          <w:p>
+            <w:pPr>
+              <w:pStyle w:val="Compact"/>
+              <w:jc w:val="center"/>
+            </w:pPr>
+            <m:oMath>
+              <m:r>
+                <m:t>I</m:t>
+              </m:r>
+              <m:r>
+                <m:t>C</m:t>
+              </m:r>
+              <m:sSub>
+                <m:e>
+                  <m:r>
+                    <m:t>C</m:t>
+                  </m:r>
+                </m:e>
+                <m:sub>
+                  <m:r>
+                    <m:t>j</m:t>
+                  </m:r>
+                </m:sub>
+              </m:sSub>
+            </m:oMath>
+            <w:r>
+              <w:t xml:space="preserve"> </w:t>
+            </w:r>
+            <w:r>
+              <w:t xml:space="preserve">(%)</w:t>
+            </w:r>
+          </w:p>
+        </w:tc>
+        <w:tc>
+          <w:tcPr/>
+          <w:p>
+            <w:pPr>
+              <w:pStyle w:val="Compact"/>
+              <w:jc w:val="left"/>
+            </w:pPr>
+            <w:r>
+              <w:t xml:space="preserve">Diagnóstico de Cobertura</w:t>
+            </w:r>
+          </w:p>
+        </w:tc>
+      </w:tr>
+      <w:tr>
+        <w:tc>
+          <w:tcPr/>
+          <w:p>
+            <w:pPr>
+              <w:pStyle w:val="Compact"/>
+              <w:jc w:val="left"/>
+            </w:pPr>
+            <w:r>
+              <w:t xml:space="preserve">Ing. en Ciberseguridad</w:t>
+            </w:r>
+          </w:p>
+        </w:tc>
+        <w:tc>
+          <w:tcPr/>
+          <w:p>
+            <w:pPr>
+              <w:pStyle w:val="Compact"/>
+              <w:jc w:val="center"/>
+            </w:pPr>
+            <w:r>
+              <w:t xml:space="preserve">0.00</w:t>
+            </w:r>
+          </w:p>
+        </w:tc>
+        <w:tc>
+          <w:tcPr/>
+          <w:p>
+            <w:pPr>
+              <w:pStyle w:val="Compact"/>
+              <w:jc w:val="center"/>
+            </w:pPr>
+            <w:r>
+              <w:t xml:space="preserve">1.00</w:t>
+            </w:r>
+          </w:p>
+        </w:tc>
+        <w:tc>
+          <w:tcPr/>
+          <w:p>
+            <w:pPr>
+              <w:pStyle w:val="Compact"/>
+              <w:jc w:val="center"/>
+            </w:pPr>
+            <w:r>
+              <w:t xml:space="preserve">0.50</w:t>
+            </w:r>
+          </w:p>
+        </w:tc>
+        <w:tc>
+          <w:tcPr/>
+          <w:p>
+            <w:pPr>
+              <w:pStyle w:val="Compact"/>
+              <w:jc w:val="center"/>
+            </w:pPr>
+            <w:r>
+              <w:t xml:space="preserve">0.00</w:t>
+            </w:r>
+          </w:p>
+        </w:tc>
+        <w:tc>
+          <w:tcPr/>
+          <w:p>
+            <w:pPr>
+              <w:pStyle w:val="Compact"/>
+              <w:jc w:val="center"/>
+            </w:pPr>
+            <w:r>
+              <w:t xml:space="preserve">1.00</w:t>
+            </w:r>
+          </w:p>
+        </w:tc>
+        <w:tc>
+          <w:tcPr/>
+          <w:p>
+            <w:pPr>
+              <w:pStyle w:val="Compact"/>
+              <w:jc w:val="center"/>
+            </w:pPr>
+            <w:r>
+              <w:t xml:space="preserve">0.00</w:t>
+            </w:r>
+          </w:p>
+        </w:tc>
+        <w:tc>
+          <w:tcPr/>
+          <w:p>
+            <w:pPr>
+              <w:pStyle w:val="Compact"/>
+              <w:jc w:val="center"/>
+            </w:pPr>
+            <w:r>
+              <w:t xml:space="preserve">0.00</w:t>
+            </w:r>
+          </w:p>
+        </w:tc>
+        <w:tc>
+          <w:tcPr/>
+          <w:p>
+            <w:pPr>
+              <w:pStyle w:val="Compact"/>
+              <w:jc w:val="center"/>
+            </w:pPr>
+            <w:r>
+              <w:t xml:space="preserve">1.00</w:t>
+            </w:r>
+          </w:p>
+        </w:tc>
+        <w:tc>
+          <w:tcPr/>
+          <w:p>
+            <w:pPr>
+              <w:pStyle w:val="Compact"/>
+              <w:jc w:val="center"/>
+            </w:pPr>
+            <w:r>
+              <w:t xml:space="preserve">1.00</w:t>
+            </w:r>
+          </w:p>
+        </w:tc>
+        <w:tc>
+          <w:tcPr/>
+          <w:p>
+            <w:pPr>
+              <w:pStyle w:val="Compact"/>
+              <w:jc w:val="center"/>
+            </w:pPr>
+            <w:r>
+              <w:rPr>
+                <w:b/>
+                <w:bCs/>
+              </w:rPr>
+              <w:t xml:space="preserve">50.0%</w:t>
+            </w:r>
+          </w:p>
+        </w:tc>
+        <w:tc>
+          <w:tcPr/>
+          <w:p>
+            <w:pPr>
+              <w:pStyle w:val="Compact"/>
+              <w:jc w:val="left"/>
+            </w:pPr>
+            <w:r>
+              <w:t xml:space="preserve">Media (Cobertura parcial)</w:t>
+            </w:r>
+          </w:p>
+        </w:tc>
+      </w:tr>
+      <w:tr>
+        <w:tc>
+          <w:tcPr/>
+          <w:p>
+            <w:pPr>
+              <w:pStyle w:val="Compact"/>
+              <w:jc w:val="left"/>
+            </w:pPr>
+            <w:r>
+              <w:t xml:space="preserve">Ing. en IA y Ciencia de Datos</w:t>
+            </w:r>
+          </w:p>
+        </w:tc>
+        <w:tc>
+          <w:tcPr/>
+          <w:p>
+            <w:pPr>
+              <w:pStyle w:val="Compact"/>
+              <w:jc w:val="center"/>
+            </w:pPr>
+            <w:r>
+              <w:t xml:space="preserve">0.00</w:t>
+            </w:r>
+          </w:p>
+        </w:tc>
+        <w:tc>
+          <w:tcPr/>
+          <w:p>
+            <w:pPr>
+              <w:pStyle w:val="Compact"/>
+              <w:jc w:val="center"/>
+            </w:pPr>
+            <w:r>
+              <w:t xml:space="preserve">1.00</w:t>
+            </w:r>
+          </w:p>
+        </w:tc>
+        <w:tc>
+          <w:tcPr/>
+          <w:p>
+            <w:pPr>
+              <w:pStyle w:val="Compact"/>
+              <w:jc w:val="center"/>
+            </w:pPr>
+            <w:r>
+              <w:t xml:space="preserve">0.50</w:t>
+            </w:r>
+          </w:p>
+        </w:tc>
+        <w:tc>
+          <w:tcPr/>
+          <w:p>
+            <w:pPr>
+              <w:pStyle w:val="Compact"/>
+              <w:jc w:val="center"/>
+            </w:pPr>
+            <w:r>
+              <w:t xml:space="preserve">1.00</w:t>
+            </w:r>
+          </w:p>
+        </w:tc>
+        <w:tc>
+          <w:tcPr/>
+          <w:p>
+            <w:pPr>
+              <w:pStyle w:val="Compact"/>
+              <w:jc w:val="center"/>
+            </w:pPr>
+            <w:r>
+              <w:t xml:space="preserve">1.00</w:t>
+            </w:r>
+          </w:p>
+        </w:tc>
+        <w:tc>
+          <w:tcPr/>
+          <w:p>
+            <w:pPr>
+              <w:pStyle w:val="Compact"/>
+              <w:jc w:val="center"/>
+            </w:pPr>
+            <w:r>
+              <w:t xml:space="preserve">0.00</w:t>
+            </w:r>
+          </w:p>
+        </w:tc>
+        <w:tc>
+          <w:tcPr/>
+          <w:p>
+            <w:pPr>
+              <w:pStyle w:val="Compact"/>
+              <w:jc w:val="center"/>
+            </w:pPr>
+            <w:r>
+              <w:t xml:space="preserve">0.00</w:t>
+            </w:r>
+          </w:p>
+        </w:tc>
+        <w:tc>
+          <w:tcPr/>
+          <w:p>
+            <w:pPr>
+              <w:pStyle w:val="Compact"/>
+              <w:jc w:val="center"/>
+            </w:pPr>
+            <w:r>
+              <w:t xml:space="preserve">0.00</w:t>
+            </w:r>
+          </w:p>
+        </w:tc>
+        <w:tc>
+          <w:tcPr/>
+          <w:p>
+            <w:pPr>
+              <w:pStyle w:val="Compact"/>
+              <w:jc w:val="center"/>
+            </w:pPr>
+            <w:r>
+              <w:t xml:space="preserve">1.00</w:t>
+            </w:r>
+          </w:p>
+        </w:tc>
+        <w:tc>
+          <w:tcPr/>
+          <w:p>
+            <w:pPr>
+              <w:pStyle w:val="Compact"/>
+              <w:jc w:val="center"/>
+            </w:pPr>
+            <w:r>
+              <w:rPr>
+                <w:b/>
+                <w:bCs/>
+              </w:rPr>
+              <w:t xml:space="preserve">50.0%</w:t>
+            </w:r>
+          </w:p>
+        </w:tc>
+        <w:tc>
+          <w:tcPr/>
+          <w:p>
+            <w:pPr>
+              <w:pStyle w:val="Compact"/>
+              <w:jc w:val="left"/>
+            </w:pPr>
+            <w:r>
+              <w:t xml:space="preserve">Media-Alta (Requiere adopción general)</w:t>
+            </w:r>
+          </w:p>
+        </w:tc>
+      </w:tr>
+      <w:tr>
+        <w:tc>
+          <w:tcPr/>
+          <w:p>
+            <w:pPr>
+              <w:pStyle w:val="Compact"/>
+              <w:jc w:val="left"/>
+            </w:pPr>
+            <w:r>
+              <w:t xml:space="preserve">Tecnología Cloud / DevOps</w:t>
+            </w:r>
+          </w:p>
+        </w:tc>
+        <w:tc>
+          <w:tcPr/>
+          <w:p>
+            <w:pPr>
+              <w:pStyle w:val="Compact"/>
+              <w:jc w:val="center"/>
+            </w:pPr>
+            <w:r>
+              <w:t xml:space="preserve">0.00</w:t>
+            </w:r>
+          </w:p>
+        </w:tc>
+        <w:tc>
+          <w:tcPr/>
+          <w:p>
+            <w:pPr>
+              <w:pStyle w:val="Compact"/>
+              <w:jc w:val="center"/>
+            </w:pPr>
+            <w:r>
+              <w:t xml:space="preserve">0.00</w:t>
+            </w:r>
+          </w:p>
+        </w:tc>
+        <w:tc>
+          <w:tcPr/>
+          <w:p>
+            <w:pPr>
+              <w:pStyle w:val="Compact"/>
+              <w:jc w:val="center"/>
+            </w:pPr>
+            <w:r>
+              <w:t xml:space="preserve">0.50</w:t>
+            </w:r>
+          </w:p>
+        </w:tc>
+        <w:tc>
+          <w:tcPr/>
+          <w:p>
+            <w:pPr>
+              <w:pStyle w:val="Compact"/>
+              <w:jc w:val="center"/>
+            </w:pPr>
+            <w:r>
+              <w:t xml:space="preserve">0.00</w:t>
+            </w:r>
+          </w:p>
+        </w:tc>
+        <w:tc>
+          <w:tcPr/>
+          <w:p>
+            <w:pPr>
+              <w:pStyle w:val="Compact"/>
+              <w:jc w:val="center"/>
+            </w:pPr>
+            <w:r>
+              <w:t xml:space="preserve">0.00</w:t>
+            </w:r>
+          </w:p>
+        </w:tc>
+        <w:tc>
+          <w:tcPr/>
+          <w:p>
+            <w:pPr>
+              <w:pStyle w:val="Compact"/>
+              <w:jc w:val="center"/>
+            </w:pPr>
+            <w:r>
+              <w:t xml:space="preserve">0.00</w:t>
+            </w:r>
+          </w:p>
+        </w:tc>
+        <w:tc>
+          <w:tcPr/>
+          <w:p>
+            <w:pPr>
+              <w:pStyle w:val="Compact"/>
+              <w:jc w:val="center"/>
+            </w:pPr>
+            <w:r>
+              <w:t xml:space="preserve">0.00</w:t>
+            </w:r>
+          </w:p>
+        </w:tc>
+        <w:tc>
+          <w:tcPr/>
+          <w:p>
+            <w:pPr>
+              <w:pStyle w:val="Compact"/>
+              <w:jc w:val="center"/>
+            </w:pPr>
+            <w:r>
+              <w:t xml:space="preserve">0.00</w:t>
+            </w:r>
+          </w:p>
+        </w:tc>
+        <w:tc>
+          <w:tcPr/>
+          <w:p>
+            <w:pPr>
+              <w:pStyle w:val="Compact"/>
+              <w:jc w:val="center"/>
+            </w:pPr>
+            <w:r>
+              <w:t xml:space="preserve">0.00</w:t>
+            </w:r>
+          </w:p>
+        </w:tc>
+        <w:tc>
+          <w:tcPr/>
+          <w:p>
+            <w:pPr>
+              <w:pStyle w:val="Compact"/>
+              <w:jc w:val="center"/>
+            </w:pPr>
+            <w:r>
+              <w:rPr>
+                <w:b/>
+                <w:bCs/>
+              </w:rPr>
+              <w:t xml:space="preserve">5.6%</w:t>
+            </w:r>
+          </w:p>
+        </w:tc>
+        <w:tc>
+          <w:tcPr/>
+          <w:p>
+            <w:pPr>
+              <w:pStyle w:val="Compact"/>
+              <w:jc w:val="left"/>
+            </w:pPr>
+            <w:r>
+              <w:t xml:space="preserve">CRÍTICA (Ausente a nivel de grado)</w:t>
+            </w:r>
+          </w:p>
+        </w:tc>
+      </w:tr>
+      <w:tr>
+        <w:tc>
+          <w:tcPr/>
+          <w:p>
+            <w:pPr>
+              <w:pStyle w:val="Compact"/>
+              <w:jc w:val="left"/>
+            </w:pPr>
+            <w:r>
+              <w:t xml:space="preserve">Ing. de Sistemas / Informática</w:t>
+            </w:r>
+          </w:p>
+        </w:tc>
+        <w:tc>
+          <w:tcPr/>
+          <w:p>
+            <w:pPr>
+              <w:pStyle w:val="Compact"/>
+              <w:jc w:val="center"/>
+            </w:pPr>
+            <w:r>
+              <w:t xml:space="preserve">1.00</w:t>
+            </w:r>
+          </w:p>
+        </w:tc>
+        <w:tc>
+          <w:tcPr/>
+          <w:p>
+            <w:pPr>
+              <w:pStyle w:val="Compact"/>
+              <w:jc w:val="center"/>
+            </w:pPr>
+            <w:r>
+              <w:t xml:space="preserve">1.00</w:t>
+            </w:r>
+          </w:p>
+        </w:tc>
+        <w:tc>
+          <w:tcPr/>
+          <w:p>
+            <w:pPr>
+              <w:pStyle w:val="Compact"/>
+              <w:jc w:val="center"/>
+            </w:pPr>
+            <w:r>
+              <w:t xml:space="preserve">0.50</w:t>
+            </w:r>
+          </w:p>
+        </w:tc>
+        <w:tc>
+          <w:tcPr/>
+          <w:p>
+            <w:pPr>
+              <w:pStyle w:val="Compact"/>
+              <w:jc w:val="center"/>
+            </w:pPr>
+            <w:r>
+              <w:t xml:space="preserve">1.00</w:t>
+            </w:r>
+          </w:p>
+        </w:tc>
+        <w:tc>
+          <w:tcPr/>
+          <w:p>
+            <w:pPr>
+              <w:pStyle w:val="Compact"/>
+              <w:jc w:val="center"/>
+            </w:pPr>
+            <w:r>
+              <w:t xml:space="preserve">1.00</w:t>
+            </w:r>
+          </w:p>
+        </w:tc>
+        <w:tc>
+          <w:tcPr/>
+          <w:p>
+            <w:pPr>
+              <w:pStyle w:val="Compact"/>
+              <w:jc w:val="center"/>
+            </w:pPr>
+            <w:r>
+              <w:t xml:space="preserve">1.00</w:t>
+            </w:r>
+          </w:p>
+        </w:tc>
+        <w:tc>
+          <w:tcPr/>
+          <w:p>
+            <w:pPr>
+              <w:pStyle w:val="Compact"/>
+              <w:jc w:val="center"/>
+            </w:pPr>
+            <w:r>
+              <w:t xml:space="preserve">1.00</w:t>
+            </w:r>
+          </w:p>
+        </w:tc>
+        <w:tc>
+          <w:tcPr/>
+          <w:p>
+            <w:pPr>
+              <w:pStyle w:val="Compact"/>
+              <w:jc w:val="center"/>
+            </w:pPr>
+            <w:r>
+              <w:t xml:space="preserve">1.00</w:t>
+            </w:r>
+          </w:p>
+        </w:tc>
+        <w:tc>
+          <w:tcPr/>
+          <w:p>
+            <w:pPr>
+              <w:pStyle w:val="Compact"/>
+              <w:jc w:val="center"/>
+            </w:pPr>
+            <w:r>
+              <w:t xml:space="preserve">1.00</w:t>
+            </w:r>
+          </w:p>
+        </w:tc>
+        <w:tc>
+          <w:tcPr/>
+          <w:p>
+            <w:pPr>
+              <w:pStyle w:val="Compact"/>
+              <w:jc w:val="center"/>
+            </w:pPr>
+            <w:r>
+              <w:rPr>
+                <w:b/>
+                <w:bCs/>
+              </w:rPr>
+              <w:t xml:space="preserve">94.4%</w:t>
+            </w:r>
+          </w:p>
+        </w:tc>
+        <w:tc>
+          <w:tcPr/>
+          <w:p>
+            <w:pPr>
+              <w:pStyle w:val="Compact"/>
+              <w:jc w:val="left"/>
+            </w:pPr>
+            <w:r>
+              <w:t xml:space="preserve">Baja (Programa tradicional cubierto)</w:t>
+            </w:r>
+          </w:p>
+        </w:tc>
+      </w:tr>
+      <w:tr>
+        <w:tc>
+          <w:tcPr/>
+          <w:p>
+            <w:pPr>
+              <w:pStyle w:val="Compact"/>
+              <w:jc w:val="left"/>
+            </w:pPr>
+            <w:r>
+              <w:t xml:space="preserve">Tecn. Ingeniería de Datos</w:t>
+            </w:r>
+          </w:p>
+        </w:tc>
+        <w:tc>
+          <w:tcPr/>
+          <w:p>
+            <w:pPr>
+              <w:pStyle w:val="Compact"/>
+              <w:jc w:val="center"/>
+            </w:pPr>
+            <w:r>
+              <w:t xml:space="preserve">0.00</w:t>
+            </w:r>
+          </w:p>
+        </w:tc>
+        <w:tc>
+          <w:tcPr/>
+          <w:p>
+            <w:pPr>
+              <w:pStyle w:val="Compact"/>
+              <w:jc w:val="center"/>
+            </w:pPr>
+            <w:r>
+              <w:t xml:space="preserve">0.00</w:t>
+            </w:r>
+          </w:p>
+        </w:tc>
+        <w:tc>
+          <w:tcPr/>
+          <w:p>
+            <w:pPr>
+              <w:pStyle w:val="Compact"/>
+              <w:jc w:val="center"/>
+            </w:pPr>
+            <w:r>
+              <w:t xml:space="preserve">0.00</w:t>
+            </w:r>
+          </w:p>
+        </w:tc>
+        <w:tc>
+          <w:tcPr/>
+          <w:p>
+            <w:pPr>
+              <w:pStyle w:val="Compact"/>
+              <w:jc w:val="center"/>
+            </w:pPr>
+            <w:r>
+              <w:t xml:space="preserve">0.00</w:t>
+            </w:r>
+          </w:p>
+        </w:tc>
+        <w:tc>
+          <w:tcPr/>
+          <w:p>
+            <w:pPr>
+              <w:pStyle w:val="Compact"/>
+              <w:jc w:val="center"/>
+            </w:pPr>
+            <w:r>
+              <w:t xml:space="preserve">0.00</w:t>
+            </w:r>
+          </w:p>
+        </w:tc>
+        <w:tc>
+          <w:tcPr/>
+          <w:p>
+            <w:pPr>
+              <w:pStyle w:val="Compact"/>
+              <w:jc w:val="center"/>
+            </w:pPr>
+            <w:r>
+              <w:t xml:space="preserve">0.00</w:t>
+            </w:r>
+          </w:p>
+        </w:tc>
+        <w:tc>
+          <w:tcPr/>
+          <w:p>
+            <w:pPr>
+              <w:pStyle w:val="Compact"/>
+              <w:jc w:val="center"/>
+            </w:pPr>
+            <w:r>
+              <w:t xml:space="preserve">0.00</w:t>
+            </w:r>
+          </w:p>
+        </w:tc>
+        <w:tc>
+          <w:tcPr/>
+          <w:p>
+            <w:pPr>
+              <w:pStyle w:val="Compact"/>
+              <w:jc w:val="center"/>
+            </w:pPr>
+            <w:r>
+              <w:t xml:space="preserve">0.00</w:t>
+            </w:r>
+          </w:p>
+        </w:tc>
+        <w:tc>
+          <w:tcPr/>
+          <w:p>
+            <w:pPr>
+              <w:pStyle w:val="Compact"/>
+              <w:jc w:val="center"/>
+            </w:pPr>
+            <w:r>
+              <w:t xml:space="preserve">0.00</w:t>
+            </w:r>
+          </w:p>
+        </w:tc>
+        <w:tc>
+          <w:tcPr/>
+          <w:p>
+            <w:pPr>
+              <w:pStyle w:val="Compact"/>
+              <w:jc w:val="center"/>
+            </w:pPr>
+            <w:r>
+              <w:rPr>
+                <w:b/>
+                <w:bCs/>
+              </w:rPr>
+              <w:t xml:space="preserve">0.0%</w:t>
+            </w:r>
+          </w:p>
+        </w:tc>
+        <w:tc>
+          <w:tcPr/>
+          <w:p>
+            <w:pPr>
+              <w:pStyle w:val="Compact"/>
+              <w:jc w:val="left"/>
+            </w:pPr>
+            <w:r>
+              <w:t xml:space="preserve">CRÍTICA (Desalineación Total)</w:t>
+            </w:r>
+          </w:p>
+        </w:tc>
+      </w:tr>
+      <w:tr>
+        <w:tc>
+          <w:tcPr/>
+          <w:p>
+            <w:pPr>
+              <w:pStyle w:val="Compact"/>
+              <w:jc w:val="left"/>
+            </w:pPr>
+            <w:r>
+              <w:t xml:space="preserve">Ing. Mecatrónica / Robótica</w:t>
+            </w:r>
+          </w:p>
+        </w:tc>
+        <w:tc>
+          <w:tcPr/>
+          <w:p>
+            <w:pPr>
+              <w:pStyle w:val="Compact"/>
+              <w:jc w:val="center"/>
+            </w:pPr>
+            <w:r>
+              <w:t xml:space="preserve">0.00</w:t>
+            </w:r>
+          </w:p>
+        </w:tc>
+        <w:tc>
+          <w:tcPr/>
+          <w:p>
+            <w:pPr>
+              <w:pStyle w:val="Compact"/>
+              <w:jc w:val="center"/>
+            </w:pPr>
+            <w:r>
+              <w:t xml:space="preserve">1.00</w:t>
+            </w:r>
+          </w:p>
+        </w:tc>
+        <w:tc>
+          <w:tcPr/>
+          <w:p>
+            <w:pPr>
+              <w:pStyle w:val="Compact"/>
+              <w:jc w:val="center"/>
+            </w:pPr>
+            <w:r>
+              <w:t xml:space="preserve">0.50</w:t>
+            </w:r>
+          </w:p>
+        </w:tc>
+        <w:tc>
+          <w:tcPr/>
+          <w:p>
+            <w:pPr>
+              <w:pStyle w:val="Compact"/>
+              <w:jc w:val="center"/>
+            </w:pPr>
+            <w:r>
+              <w:t xml:space="preserve">1.00</w:t>
+            </w:r>
+          </w:p>
+        </w:tc>
+        <w:tc>
+          <w:tcPr/>
+          <w:p>
+            <w:pPr>
+              <w:pStyle w:val="Compact"/>
+              <w:jc w:val="center"/>
+            </w:pPr>
+            <w:r>
+              <w:t xml:space="preserve">1.00</w:t>
+            </w:r>
+          </w:p>
+        </w:tc>
+        <w:tc>
+          <w:tcPr/>
+          <w:p>
+            <w:pPr>
+              <w:pStyle w:val="Compact"/>
+              <w:jc w:val="center"/>
+            </w:pPr>
+            <w:r>
+              <w:t xml:space="preserve">0.00</w:t>
+            </w:r>
+          </w:p>
+        </w:tc>
+        <w:tc>
+          <w:tcPr/>
+          <w:p>
+            <w:pPr>
+              <w:pStyle w:val="Compact"/>
+              <w:jc w:val="center"/>
+            </w:pPr>
+            <w:r>
+              <w:t xml:space="preserve">0.00</w:t>
+            </w:r>
+          </w:p>
+        </w:tc>
+        <w:tc>
+          <w:tcPr/>
+          <w:p>
+            <w:pPr>
+              <w:pStyle w:val="Compact"/>
+              <w:jc w:val="center"/>
+            </w:pPr>
+            <w:r>
+              <w:t xml:space="preserve">0.00</w:t>
+            </w:r>
+          </w:p>
+        </w:tc>
+        <w:tc>
+          <w:tcPr/>
+          <w:p>
+            <w:pPr>
+              <w:pStyle w:val="Compact"/>
+              <w:jc w:val="center"/>
+            </w:pPr>
+            <w:r>
+              <w:t xml:space="preserve">0.00</w:t>
+            </w:r>
+          </w:p>
+        </w:tc>
+        <w:tc>
+          <w:tcPr/>
+          <w:p>
+            <w:pPr>
+              <w:pStyle w:val="Compact"/>
+              <w:jc w:val="center"/>
+            </w:pPr>
+            <w:r>
+              <w:rPr>
+                <w:b/>
+                <w:bCs/>
+              </w:rPr>
+              <w:t xml:space="preserve">38.9%</w:t>
+            </w:r>
+          </w:p>
+        </w:tc>
+        <w:tc>
+          <w:tcPr/>
+          <w:p>
+            <w:pPr>
+              <w:pStyle w:val="Compact"/>
+              <w:jc w:val="left"/>
+            </w:pPr>
+            <w:r>
+              <w:t xml:space="preserve">Media</w:t>
+            </w:r>
+          </w:p>
+        </w:tc>
+      </w:tr>
+      <w:tr>
+        <w:tc>
+          <w:tcPr/>
+          <w:p>
+            <w:pPr>
+              <w:pStyle w:val="Compact"/>
+              <w:jc w:val="left"/>
+            </w:pPr>
+            <w:r>
+              <w:t xml:space="preserve">Tecn. Semiconductores</w:t>
+            </w:r>
+          </w:p>
+        </w:tc>
+        <w:tc>
+          <w:tcPr/>
+          <w:p>
+            <w:pPr>
+              <w:pStyle w:val="Compact"/>
+              <w:jc w:val="center"/>
+            </w:pPr>
+            <w:r>
+              <w:t xml:space="preserve">0.00</w:t>
+            </w:r>
+          </w:p>
+        </w:tc>
+        <w:tc>
+          <w:tcPr/>
+          <w:p>
+            <w:pPr>
+              <w:pStyle w:val="Compact"/>
+              <w:jc w:val="center"/>
+            </w:pPr>
+            <w:r>
+              <w:t xml:space="preserve">0.00</w:t>
+            </w:r>
+          </w:p>
+        </w:tc>
+        <w:tc>
+          <w:tcPr/>
+          <w:p>
+            <w:pPr>
+              <w:pStyle w:val="Compact"/>
+              <w:jc w:val="center"/>
+            </w:pPr>
+            <w:r>
+              <w:t xml:space="preserve">0.50</w:t>
+            </w:r>
+          </w:p>
+        </w:tc>
+        <w:tc>
+          <w:tcPr/>
+          <w:p>
+            <w:pPr>
+              <w:pStyle w:val="Compact"/>
+              <w:jc w:val="center"/>
+            </w:pPr>
+            <w:r>
+              <w:t xml:space="preserve">0.00</w:t>
+            </w:r>
+          </w:p>
+        </w:tc>
+        <w:tc>
+          <w:tcPr/>
+          <w:p>
+            <w:pPr>
+              <w:pStyle w:val="Compact"/>
+              <w:jc w:val="center"/>
+            </w:pPr>
+            <w:r>
+              <w:t xml:space="preserve">0.00</w:t>
+            </w:r>
+          </w:p>
+        </w:tc>
+        <w:tc>
+          <w:tcPr/>
+          <w:p>
+            <w:pPr>
+              <w:pStyle w:val="Compact"/>
+              <w:jc w:val="center"/>
+            </w:pPr>
+            <w:r>
+              <w:t xml:space="preserve">0.00</w:t>
+            </w:r>
+          </w:p>
+        </w:tc>
+        <w:tc>
+          <w:tcPr/>
+          <w:p>
+            <w:pPr>
+              <w:pStyle w:val="Compact"/>
+              <w:jc w:val="center"/>
+            </w:pPr>
+            <w:r>
+              <w:t xml:space="preserve">0.00</w:t>
+            </w:r>
+          </w:p>
+        </w:tc>
+        <w:tc>
+          <w:tcPr/>
+          <w:p>
+            <w:pPr>
+              <w:pStyle w:val="Compact"/>
+              <w:jc w:val="center"/>
+            </w:pPr>
+            <w:r>
+              <w:t xml:space="preserve">0.00</w:t>
+            </w:r>
+          </w:p>
+        </w:tc>
+        <w:tc>
+          <w:tcPr/>
+          <w:p>
+            <w:pPr>
+              <w:pStyle w:val="Compact"/>
+              <w:jc w:val="center"/>
+            </w:pPr>
+            <w:r>
+              <w:t xml:space="preserve">0.00</w:t>
+            </w:r>
+          </w:p>
+        </w:tc>
+        <w:tc>
+          <w:tcPr/>
+          <w:p>
+            <w:pPr>
+              <w:pStyle w:val="Compact"/>
+              <w:jc w:val="center"/>
+            </w:pPr>
+            <w:r>
+              <w:rPr>
+                <w:b/>
+                <w:bCs/>
+              </w:rPr>
+              <w:t xml:space="preserve">5.6%</w:t>
+            </w:r>
+          </w:p>
+        </w:tc>
+        <w:tc>
+          <w:tcPr/>
+          <w:p>
+            <w:pPr>
+              <w:pStyle w:val="Compact"/>
+              <w:jc w:val="left"/>
+            </w:pPr>
+            <w:r>
+              <w:t xml:space="preserve">Media</w:t>
+            </w:r>
+          </w:p>
+        </w:tc>
+      </w:tr>
+    </w:tbl>
     <w:p>
       <w:pPr>
         <w:pStyle w:val="BodyText"/>
@@ -1657,11 +3383,9 @@
       <w:r>
         <w:t xml:space="preserve">. Este resultado sugiere una ausencia de programas de grado completos específicamente orientados a esta disciplina en las instituciones analizadas. A pesar de que las empresas locales y los bancos dominicanos demandan masivamente perfiles para estructurar tuberías de procesamiento analítico (ETL) e implementaciones de inteligencia artificial, los profesionales se ven forzados a autoformarse o a migrar de la Ingeniería de Sistemas.</w:t>
       </w:r>
-    </w:p>
-    <w:p>
-      <w:pPr>
-        <w:pStyle w:val="BodyText"/>
-      </w:pPr>
+      <w:r>
+        <w:t xml:space="preserve"> </w:t>
+      </w:r>
       <w:r>
         <w:t xml:space="preserve">Asimismo, Cloud Computing / DevOps registra un bajo</w:t>
       </w:r>
@@ -1709,9 +3433,9 @@
         </w:pict>
       </w:r>
     </w:p>
-    <w:bookmarkEnd w:id="18"/>
     <w:bookmarkEnd w:id="19"/>
-    <w:bookmarkStart w:id="23" w:name="discusión-y-propuestas-educativas-steam"/>
+    <w:bookmarkEnd w:id="20"/>
+    <w:bookmarkStart w:id="24" w:name="discusión-y-propuestas-educativas-steam"/>
     <w:p>
       <w:pPr>
         <w:pStyle w:val="Heading2"/>
@@ -1736,7 +3460,7 @@
         <w:t xml:space="preserve">Para mitigar esta brecha de manera estructural, se proponen tres programas de formación e inserción curricular prioritaria basados directamente en el análisis cuantitativo de resultados:</w:t>
       </w:r>
     </w:p>
-    <w:bookmarkStart w:id="20" w:name="Xa97ea8c557202e54fd8682ca56878a11f587de6"/>
+    <w:bookmarkStart w:id="21" w:name="Xa97ea8c557202e54fd8682ca56878a11f587de6"/>
     <w:p>
       <w:pPr>
         <w:pStyle w:val="Heading3"/>
@@ -1781,8 +3505,8 @@
         <w:t xml:space="preserve">Componentes Clave del Pénsum: Terraform &amp; Ansible, Kubernetes y Docker, Observabilidad (Prometheus/Grafana), DevSecOps y Gobernanza Cloud (OpEx).</w:t>
       </w:r>
     </w:p>
-    <w:bookmarkEnd w:id="20"/>
-    <w:bookmarkStart w:id="21" w:name="X5137c04f3c4aa7563bd04bae2f5ef824ad3d470"/>
+    <w:bookmarkEnd w:id="21"/>
+    <w:bookmarkStart w:id="22" w:name="X5137c04f3c4aa7563bd04bae2f5ef824ad3d470"/>
     <w:p>
       <w:pPr>
         <w:pStyle w:val="Heading3"/>
@@ -1827,8 +3551,8 @@
         <w:t xml:space="preserve">Componentes Clave del Pénsum: SQL Avanzado y bases de datos NoSQL, Apache Spark y Kafka, Orquestación de datos (Airflow/dbt), Gobernanza de datos corporativos.</w:t>
       </w:r>
     </w:p>
-    <w:bookmarkEnd w:id="21"/>
-    <w:bookmarkStart w:id="22" w:name="Xd92ba02f45bf5bce62d0d0a57980c0fc03315e7"/>
+    <w:bookmarkEnd w:id="22"/>
+    <w:bookmarkStart w:id="23" w:name="Xd92ba02f45bf5bce62d0d0a57980c0fc03315e7"/>
     <w:p>
       <w:pPr>
         <w:pStyle w:val="Heading3"/>
@@ -1880,9 +3604,9 @@
         </w:pict>
       </w:r>
     </w:p>
-    <w:bookmarkEnd w:id="22"/>
     <w:bookmarkEnd w:id="23"/>
-    <w:bookmarkStart w:id="24" w:name="conclusiones"/>
+    <w:bookmarkEnd w:id="24"/>
+    <w:bookmarkStart w:id="25" w:name="conclusiones"/>
     <w:p>
       <w:pPr>
         <w:pStyle w:val="Heading2"/>
@@ -1964,8 +3688,8 @@
         </w:pict>
       </w:r>
     </w:p>
-    <w:bookmarkEnd w:id="24"/>
-    <w:bookmarkStart w:id="25" w:name="limitaciones-de-la-investigación"/>
+    <w:bookmarkEnd w:id="25"/>
+    <w:bookmarkStart w:id="26" w:name="limitaciones-de-la-investigación"/>
     <w:p>
       <w:pPr>
         <w:pStyle w:val="Heading2"/>
@@ -2099,8 +3823,8 @@
         </w:pict>
       </w:r>
     </w:p>
-    <w:bookmarkEnd w:id="25"/>
-    <w:bookmarkStart w:id="26" w:name="X7f0fa3337519dc38c542e11e381cf1419a9bb9f"/>
+    <w:bookmarkEnd w:id="26"/>
+    <w:bookmarkStart w:id="27" w:name="X7f0fa3337519dc38c542e11e381cf1419a9bb9f"/>
     <w:p>
       <w:pPr>
         <w:pStyle w:val="Heading2"/>
@@ -2124,8 +3848,8 @@
         </w:pict>
       </w:r>
     </w:p>
-    <w:bookmarkEnd w:id="26"/>
-    <w:bookmarkStart w:id="27" w:name="fuentes-de-datos-laborales"/>
+    <w:bookmarkEnd w:id="27"/>
+    <w:bookmarkStart w:id="28" w:name="fuentes-de-datos-laborales"/>
     <w:p>
       <w:pPr>
         <w:pStyle w:val="Heading2"/>
@@ -2185,8 +3909,8 @@
         </w:pict>
       </w:r>
     </w:p>
-    <w:bookmarkEnd w:id="27"/>
-    <w:bookmarkStart w:id="28" w:name="Xbf1251c556fc8cc45f0d2c80a8fed438e39a6b7"/>
+    <w:bookmarkEnd w:id="28"/>
+    <w:bookmarkStart w:id="29" w:name="Xbf1251c556fc8cc45f0d2c80a8fed438e39a6b7"/>
     <w:p>
       <w:pPr>
         <w:pStyle w:val="Heading2"/>
@@ -2936,8 +4660,8 @@
         </w:pict>
       </w:r>
     </w:p>
-    <w:bookmarkEnd w:id="28"/>
-    <w:bookmarkStart w:id="29" w:name="Xbfcd938220bc5c728994ab2d7f729737eacc206"/>
+    <w:bookmarkEnd w:id="29"/>
+    <w:bookmarkStart w:id="30" w:name="Xbfcd938220bc5c728994ab2d7f729737eacc206"/>
     <w:p>
       <w:pPr>
         <w:pStyle w:val="Heading2"/>
@@ -3492,8 +5216,8 @@
         </w:pict>
       </w:r>
     </w:p>
-    <w:bookmarkEnd w:id="29"/>
-    <w:bookmarkStart w:id="30" w:name="X602269567ba0671637644346f4c3a79c31de7ee"/>
+    <w:bookmarkEnd w:id="30"/>
+    <w:bookmarkStart w:id="31" w:name="X602269567ba0671637644346f4c3a79c31de7ee"/>
     <w:p>
       <w:pPr>
         <w:pStyle w:val="Heading2"/>
@@ -3563,8 +5287,8 @@
         </w:pict>
       </w:r>
     </w:p>
-    <w:bookmarkEnd w:id="30"/>
-    <w:bookmarkStart w:id="31" w:name="X700070ca916f65360e4134ff43fba5a1df12138"/>
+    <w:bookmarkEnd w:id="31"/>
+    <w:bookmarkStart w:id="32" w:name="X700070ca916f65360e4134ff43fba5a1df12138"/>
     <w:p>
       <w:pPr>
         <w:pStyle w:val="Heading2"/>
@@ -5407,8 +7131,8 @@
         </w:tc>
       </w:tr>
     </w:tbl>
-    <w:bookmarkEnd w:id="31"/>
     <w:bookmarkEnd w:id="32"/>
+    <w:bookmarkEnd w:id="33"/>
     <w:sectPr>
       <w:footnotePr>
         <w:numRestart w:val="eachSect"/>

</xml_diff>

<commit_message>
docs: update Mechatronics/Robotics curriculum alignment data in scientific article
</commit_message>
<xml_diff>
--- a/articulo_cientifico_brecha_talento.docx
+++ b/articulo_cientifico_brecha_talento.docx
@@ -3099,7 +3099,7 @@
               <w:jc w:val="center"/>
             </w:pPr>
             <w:r>
-              <w:t xml:space="preserve">1.00</w:t>
+              <w:t xml:space="preserve">0.00</w:t>
             </w:r>
           </w:p>
         </w:tc>
@@ -3175,19 +3175,19 @@
                 <w:b/>
                 <w:bCs/>
               </w:rPr>
-              <w:t xml:space="preserve">38.9%</w:t>
-            </w:r>
-          </w:p>
-        </w:tc>
-        <w:tc>
-          <w:tcPr/>
-          <w:p>
-            <w:pPr>
-              <w:pStyle w:val="Compact"/>
-              <w:jc w:val="left"/>
-            </w:pPr>
-            <w:r>
-              <w:t xml:space="preserve">Media</w:t>
+              <w:t xml:space="preserve">27.8%</w:t>
+            </w:r>
+          </w:p>
+        </w:tc>
+        <w:tc>
+          <w:tcPr/>
+          <w:p>
+            <w:pPr>
+              <w:pStyle w:val="Compact"/>
+              <w:jc w:val="left"/>
+            </w:pPr>
+            <w:r>
+              <w:t xml:space="preserve">Media-Baja</w:t>
             </w:r>
           </w:p>
         </w:tc>

</xml_diff>